<commit_message>
UD04: corrige numeración de puntos obsoleta, unifica CEs y añade sumarización
</commit_message>
<xml_diff>
--- a/docx/03-capa-de-enlace/03-capa-de-enlace.docx
+++ b/docx/03-capa-de-enlace/03-capa-de-enlace.docx
@@ -3307,7 +3307,7 @@
     </w:p>
     <w:bookmarkEnd w:id="45"/>
     <w:bookmarkEnd w:id="46"/>
-    <w:bookmarkStart w:id="61" w:name="direcciones-mac"/>
+    <w:bookmarkStart w:id="64" w:name="direcciones-mac"/>
     <w:p>
       <w:pPr>
         <w:pStyle w:val="Heading1"/>
@@ -3927,7 +3927,7 @@
       </w:r>
     </w:p>
     <w:bookmarkEnd w:id="51"/>
-    <w:bookmarkStart w:id="52" w:name="unicast-multicast-y-broadcast"/>
+    <w:bookmarkStart w:id="55" w:name="unicast-multicast-y-broadcast"/>
     <w:p>
       <w:pPr>
         <w:pStyle w:val="Heading2"/>
@@ -4057,6 +4057,70 @@
       </w:r>
       <w:r>
         <w:t xml:space="preserve">(la cambias tú).</w:t>
+      </w:r>
+    </w:p>
+    <w:p>
+      <w:pPr>
+        <w:pStyle w:val="CaptionedFigure"/>
+      </w:pPr>
+      <w:r>
+        <w:drawing>
+          <wp:inline>
+            <wp:extent cx="5334000" cy="2905125"/>
+            <wp:effectExtent b="0" l="0" r="0" t="0"/>
+            <wp:docPr descr="Unicast, multicast y broadcast: una tarjeta concreta, solo las del grupo o todas a la vez, según el bit I/G del primer byte" title="" id="53" name="Picture"/>
+            <a:graphic>
+              <a:graphicData uri="http://schemas.openxmlformats.org/drawingml/2006/picture">
+                <pic:pic>
+                  <pic:nvPicPr>
+                    <pic:cNvPr descr="public/diagrams/u03-unicast-multicast-broadcast.svg" id="54" name="Picture"/>
+                    <pic:cNvPicPr>
+                      <a:picLocks noChangeArrowheads="1" noChangeAspect="1"/>
+                    </pic:cNvPicPr>
+                  </pic:nvPicPr>
+                  <pic:blipFill>
+                    <a:blip>
+                      <a:extLst>
+                        <a:ext uri="{28A0092B-C50C-407E-A947-70E740481C1C}">
+                          <a14:useLocalDpi xmlns:a14="http://schemas.microsoft.com/office/drawing/2010/main" val="0"/>
+                        </a:ext>
+                        <a:ext uri="{96DAC541-7B7A-43D3-8B79-37D633B846F1}">
+                          <asvg:svgBlip xmlns:asvg="http://schemas.microsoft.com/office/drawing/2016/SVG/main" r:embed="rId52"/>
+                        </a:ext>
+                      </a:extLst>
+                    </a:blip>
+                    <a:stretch>
+                      <a:fillRect/>
+                    </a:stretch>
+                  </pic:blipFill>
+                  <pic:spPr bwMode="auto">
+                    <a:xfrm>
+                      <a:off x="0" y="0"/>
+                      <a:ext cx="5334000" cy="2905125"/>
+                    </a:xfrm>
+                    <a:prstGeom prst="rect">
+                      <a:avLst/>
+                    </a:prstGeom>
+                    <a:noFill/>
+                    <a:ln w="9525">
+                      <a:noFill/>
+                      <a:headEnd/>
+                      <a:tailEnd/>
+                    </a:ln>
+                  </pic:spPr>
+                </pic:pic>
+              </a:graphicData>
+            </a:graphic>
+          </wp:inline>
+        </w:drawing>
+      </w:r>
+    </w:p>
+    <w:p>
+      <w:pPr>
+        <w:pStyle w:val="ImageCaption"/>
+      </w:pPr>
+      <w:r>
+        <w:t xml:space="preserve">Unicast, multicast y broadcast: una tarjeta concreta, solo las del grupo o todas a la vez, según el bit I/G del primer byte</w:t>
       </w:r>
     </w:p>
     <w:tbl>
@@ -4304,8 +4368,8 @@
         </w:pict>
       </w:r>
     </w:p>
-    <w:bookmarkEnd w:id="52"/>
-    <w:bookmarkStart w:id="53" w:name="mac-frente-a-ip-dos-carnés-dos-ámbitos"/>
+    <w:bookmarkEnd w:id="55"/>
+    <w:bookmarkStart w:id="56" w:name="mac-frente-a-ip-dos-carnés-dos-ámbitos"/>
     <w:p>
       <w:pPr>
         <w:pStyle w:val="Heading2"/>
@@ -4712,8 +4776,8 @@
         </w:pict>
       </w:r>
     </w:p>
-    <w:bookmarkEnd w:id="53"/>
-    <w:bookmarkStart w:id="55" w:name="dónde-vive-y-cómo-la-ves"/>
+    <w:bookmarkEnd w:id="56"/>
+    <w:bookmarkStart w:id="58" w:name="dónde-vive-y-cómo-la-ves"/>
     <w:p>
       <w:pPr>
         <w:pStyle w:val="Heading2"/>
@@ -4862,7 +4926,7 @@
       <w:r>
         <w:t xml:space="preserve"> </w:t>
       </w:r>
-      <w:hyperlink r:id="rId54">
+      <w:hyperlink r:id="rId57">
         <w:r>
           <w:rPr>
             <w:rStyle w:val="Hyperlink"/>
@@ -4983,8 +5047,8 @@
         </w:pict>
       </w:r>
     </w:p>
-    <w:bookmarkEnd w:id="55"/>
-    <w:bookmarkStart w:id="57" w:name="el-puente-con-ip-arp-solo-la-puerta"/>
+    <w:bookmarkEnd w:id="58"/>
+    <w:bookmarkStart w:id="60" w:name="el-puente-con-ip-arp-solo-la-puerta"/>
     <w:p>
       <w:pPr>
         <w:pStyle w:val="Heading2"/>
@@ -5045,7 +5109,7 @@
       <w:r>
         <w:t xml:space="preserve"> </w:t>
       </w:r>
-      <w:hyperlink r:id="rId56">
+      <w:hyperlink r:id="rId59">
         <w:r>
           <w:rPr>
             <w:rStyle w:val="Hyperlink"/>
@@ -5077,8 +5141,8 @@
         </w:pict>
       </w:r>
     </w:p>
-    <w:bookmarkEnd w:id="57"/>
-    <w:bookmarkStart w:id="58" w:name="mini-chequeo-1"/>
+    <w:bookmarkEnd w:id="60"/>
+    <w:bookmarkStart w:id="61" w:name="mini-chequeo-1"/>
     <w:p>
       <w:pPr>
         <w:pStyle w:val="Heading2"/>
@@ -5311,8 +5375,8 @@
         </w:pict>
       </w:r>
     </w:p>
-    <w:bookmarkEnd w:id="58"/>
-    <w:bookmarkStart w:id="59" w:name="resumen-en-3-frases-1"/>
+    <w:bookmarkEnd w:id="61"/>
+    <w:bookmarkStart w:id="62" w:name="resumen-en-3-frases-1"/>
     <w:p>
       <w:pPr>
         <w:pStyle w:val="Heading2"/>
@@ -5437,8 +5501,8 @@
         <w:t xml:space="preserve">y ARP son el puente entre ambos mundos: sin MAC no hay trama, y ARP traduce la IP que conoces en la MAC que necesitas.</w:t>
       </w:r>
     </w:p>
-    <w:bookmarkEnd w:id="59"/>
-    <w:bookmarkStart w:id="60" w:name="vocabulario-rápido-1"/>
+    <w:bookmarkEnd w:id="62"/>
+    <w:bookmarkStart w:id="63" w:name="vocabulario-rápido-1"/>
     <w:p>
       <w:pPr>
         <w:pStyle w:val="Heading2"/>
@@ -5699,9 +5763,9 @@
         </w:r>
       </w:hyperlink>
     </w:p>
-    <w:bookmarkEnd w:id="60"/>
-    <w:bookmarkEnd w:id="61"/>
-    <w:bookmarkStart w:id="74" w:name="la-trama-ethernet"/>
+    <w:bookmarkEnd w:id="63"/>
+    <w:bookmarkEnd w:id="64"/>
+    <w:bookmarkStart w:id="77" w:name="la-trama-ethernet"/>
     <w:p>
       <w:pPr>
         <w:pStyle w:val="Heading1"/>
@@ -5765,7 +5829,7 @@
         </w:pict>
       </w:r>
     </w:p>
-    <w:bookmarkStart w:id="62" w:name="la-idea-en-una-frase-2"/>
+    <w:bookmarkStart w:id="65" w:name="la-idea-en-una-frase-2"/>
     <w:p>
       <w:pPr>
         <w:pStyle w:val="Heading2"/>
@@ -5929,8 +5993,8 @@
         </w:pict>
       </w:r>
     </w:p>
-    <w:bookmarkEnd w:id="62"/>
-    <w:bookmarkStart w:id="63" w:name="de-bits-a-trama-capa-1-capa-2"/>
+    <w:bookmarkEnd w:id="65"/>
+    <w:bookmarkStart w:id="66" w:name="de-bits-a-trama-capa-1-capa-2"/>
     <w:p>
       <w:pPr>
         <w:pStyle w:val="Heading2"/>
@@ -6121,8 +6185,8 @@
         </w:pict>
       </w:r>
     </w:p>
-    <w:bookmarkEnd w:id="63"/>
-    <w:bookmarkStart w:id="67" w:name="Xa6233ec4034fce4ef2691de5233630fb892c42d"/>
+    <w:bookmarkEnd w:id="66"/>
+    <w:bookmarkStart w:id="70" w:name="Xa6233ec4034fce4ef2691de5233630fb892c42d"/>
     <w:p>
       <w:pPr>
         <w:pStyle w:val="Heading2"/>
@@ -6662,7 +6726,7 @@
       <w:r>
         <w:t xml:space="preserve"> </w:t>
       </w:r>
-      <w:hyperlink r:id="rId56">
+      <w:hyperlink r:id="rId59">
         <w:r>
           <w:rPr>
             <w:rStyle w:val="Hyperlink"/>
@@ -6785,7 +6849,7 @@
       <w:r>
         <w:t xml:space="preserve"> </w:t>
       </w:r>
-      <w:hyperlink r:id="rId56">
+      <w:hyperlink r:id="rId59">
         <w:r>
           <w:rPr>
             <w:rStyle w:val="Hyperlink"/>
@@ -6819,12 +6883,12 @@
           <wp:inline>
             <wp:extent cx="5334000" cy="3091542"/>
             <wp:effectExtent b="0" l="0" r="0" t="0"/>
-            <wp:docPr descr="Trama Ethernet (Ethernet II): MACs, EtherType, payload y FCS" title="" id="65" name="Picture"/>
+            <wp:docPr descr="Trama Ethernet (Ethernet II): MACs, EtherType, payload y FCS" title="" id="68" name="Picture"/>
             <a:graphic>
               <a:graphicData uri="http://schemas.openxmlformats.org/drawingml/2006/picture">
                 <pic:pic>
                   <pic:nvPicPr>
-                    <pic:cNvPr descr="public/diagrams/u03-trama-ethernet.svg" id="66" name="Picture"/>
+                    <pic:cNvPr descr="public/diagrams/u03-trama-ethernet.svg" id="69" name="Picture"/>
                     <pic:cNvPicPr>
                       <a:picLocks noChangeArrowheads="1" noChangeAspect="1"/>
                     </pic:cNvPicPr>
@@ -6836,7 +6900,7 @@
                           <a14:useLocalDpi xmlns:a14="http://schemas.microsoft.com/office/drawing/2010/main" val="0"/>
                         </a:ext>
                         <a:ext uri="{96DAC541-7B7A-43D3-8B79-37D633B846F1}">
-                          <asvg:svgBlip xmlns:asvg="http://schemas.microsoft.com/office/drawing/2016/SVG/main" r:embed="rId64"/>
+                          <asvg:svgBlip xmlns:asvg="http://schemas.microsoft.com/office/drawing/2016/SVG/main" r:embed="rId67"/>
                         </a:ext>
                       </a:extLst>
                     </a:blip>
@@ -6970,8 +7034,8 @@
         </w:pict>
       </w:r>
     </w:p>
-    <w:bookmarkEnd w:id="67"/>
-    <w:bookmarkStart w:id="69" w:name="la-trama-en-el-aire-medios-no-guiados"/>
+    <w:bookmarkEnd w:id="70"/>
+    <w:bookmarkStart w:id="72" w:name="la-trama-en-el-aire-medios-no-guiados"/>
     <w:p>
       <w:pPr>
         <w:pStyle w:val="Heading2"/>
@@ -7490,7 +7554,7 @@
       <w:r>
         <w:t xml:space="preserve"> </w:t>
       </w:r>
-      <w:hyperlink r:id="rId68">
+      <w:hyperlink r:id="rId71">
         <w:r>
           <w:rPr>
             <w:rStyle w:val="Hyperlink"/>
@@ -7522,8 +7586,8 @@
         </w:pict>
       </w:r>
     </w:p>
-    <w:bookmarkEnd w:id="69"/>
-    <w:bookmarkStart w:id="70" w:name="cómo-lo-ves-en-vivo-wireshark"/>
+    <w:bookmarkEnd w:id="72"/>
+    <w:bookmarkStart w:id="73" w:name="cómo-lo-ves-en-vivo-wireshark"/>
     <w:p>
       <w:pPr>
         <w:pStyle w:val="Heading2"/>
@@ -7713,8 +7777,8 @@
         </w:pict>
       </w:r>
     </w:p>
-    <w:bookmarkEnd w:id="70"/>
-    <w:bookmarkStart w:id="71" w:name="mini-chequeo-2"/>
+    <w:bookmarkEnd w:id="73"/>
+    <w:bookmarkStart w:id="74" w:name="mini-chequeo-2"/>
     <w:p>
       <w:pPr>
         <w:pStyle w:val="Heading2"/>
@@ -7946,8 +8010,8 @@
         </w:pict>
       </w:r>
     </w:p>
-    <w:bookmarkEnd w:id="71"/>
-    <w:bookmarkStart w:id="72" w:name="resumen-en-3-frases-2"/>
+    <w:bookmarkEnd w:id="74"/>
+    <w:bookmarkStart w:id="75" w:name="resumen-en-3-frases-2"/>
     <w:p>
       <w:pPr>
         <w:pStyle w:val="Heading2"/>
@@ -8092,8 +8156,8 @@
         <w:t xml:space="preserve">El EtherType etiqueta el contenido (IPv4, IPv6, ARP…); ARP se estudia a fondo en la unidad de dirección IP.</w:t>
       </w:r>
     </w:p>
-    <w:bookmarkEnd w:id="72"/>
-    <w:bookmarkStart w:id="73" w:name="vocabulario-rápido-2"/>
+    <w:bookmarkEnd w:id="75"/>
+    <w:bookmarkStart w:id="76" w:name="vocabulario-rápido-2"/>
     <w:p>
       <w:pPr>
         <w:pStyle w:val="Heading2"/>
@@ -8389,9 +8453,9 @@
         </w:r>
       </w:hyperlink>
     </w:p>
-    <w:bookmarkEnd w:id="73"/>
-    <w:bookmarkEnd w:id="74"/>
-    <w:bookmarkStart w:id="86" w:name="encapsulación-de-la-trama-al-paquete"/>
+    <w:bookmarkEnd w:id="76"/>
+    <w:bookmarkEnd w:id="77"/>
+    <w:bookmarkStart w:id="92" w:name="encapsulación-de-la-trama-al-paquete"/>
     <w:p>
       <w:pPr>
         <w:pStyle w:val="Heading1"/>
@@ -8455,7 +8519,7 @@
         </w:pict>
       </w:r>
     </w:p>
-    <w:bookmarkStart w:id="75" w:name="la-idea-en-una-frase-3"/>
+    <w:bookmarkStart w:id="78" w:name="la-idea-en-una-frase-3"/>
     <w:p>
       <w:pPr>
         <w:pStyle w:val="Heading2"/>
@@ -8518,8 +8582,8 @@
         </w:pict>
       </w:r>
     </w:p>
-    <w:bookmarkEnd w:id="75"/>
-    <w:bookmarkStart w:id="79" w:name="las-muñecas-rusas-pdu-y-cabeceras"/>
+    <w:bookmarkEnd w:id="78"/>
+    <w:bookmarkStart w:id="82" w:name="las-muñecas-rusas-pdu-y-cabeceras"/>
     <w:p>
       <w:pPr>
         <w:pStyle w:val="Heading2"/>
@@ -8588,12 +8652,12 @@
           <wp:inline>
             <wp:extent cx="5334000" cy="2095500"/>
             <wp:effectExtent b="0" l="0" r="0" t="0"/>
-            <wp:docPr descr="Flujo de encapsulación: los datos se envuelven capa a capa (datos, segmento TCP, paquete IP, trama Ethernet y bits) y al llegar cada capa se quita su cabecera" title="" id="77" name="Picture"/>
+            <wp:docPr descr="Flujo de encapsulación: los datos se envuelven capa a capa (datos, segmento TCP, paquete IP, trama Ethernet y bits) y al llegar cada capa se quita su cabecera" title="" id="80" name="Picture"/>
             <a:graphic>
               <a:graphicData uri="http://schemas.openxmlformats.org/drawingml/2006/picture">
                 <pic:pic>
                   <pic:nvPicPr>
-                    <pic:cNvPr descr="public/diagrams/u03-flujo-encapsulacion.svg" id="78" name="Picture"/>
+                    <pic:cNvPr descr="public/diagrams/u03-flujo-encapsulacion.svg" id="81" name="Picture"/>
                     <pic:cNvPicPr>
                       <a:picLocks noChangeArrowheads="1" noChangeAspect="1"/>
                     </pic:cNvPicPr>
@@ -8605,7 +8669,7 @@
                           <a14:useLocalDpi xmlns:a14="http://schemas.microsoft.com/office/drawing/2010/main" val="0"/>
                         </a:ext>
                         <a:ext uri="{96DAC541-7B7A-43D3-8B79-37D633B846F1}">
-                          <asvg:svgBlip xmlns:asvg="http://schemas.microsoft.com/office/drawing/2016/SVG/main" r:embed="rId76"/>
+                          <asvg:svgBlip xmlns:asvg="http://schemas.microsoft.com/office/drawing/2016/SVG/main" r:embed="rId79"/>
                         </a:ext>
                       </a:extLst>
                     </a:blip>
@@ -8957,8 +9021,8 @@
         </w:pict>
       </w:r>
     </w:p>
-    <w:bookmarkEnd w:id="79"/>
-    <w:bookmarkStart w:id="80" w:name="X51accb6bad00f89ab55a5cc8e0c59949e069e0d"/>
+    <w:bookmarkEnd w:id="82"/>
+    <w:bookmarkStart w:id="86" w:name="X51accb6bad00f89ab55a5cc8e0c59949e069e0d"/>
     <w:p>
       <w:pPr>
         <w:pStyle w:val="Heading2"/>
@@ -8986,6 +9050,70 @@
       </w:r>
       <w:r>
         <w:t xml:space="preserve">:</w:t>
+      </w:r>
+    </w:p>
+    <w:p>
+      <w:pPr>
+        <w:pStyle w:val="CaptionedFigure"/>
+      </w:pPr>
+      <w:r>
+        <w:drawing>
+          <wp:inline>
+            <wp:extent cx="5334000" cy="3006436"/>
+            <wp:effectExtent b="0" l="0" r="0" t="0"/>
+            <wp:docPr descr="Viaje de un paquete de la PC al servidor: la trama usa MACs de PC a router y luego de router a servidor, mientras la IP de destino se conserva en todo el recorrido" title="" id="84" name="Picture"/>
+            <a:graphic>
+              <a:graphicData uri="http://schemas.openxmlformats.org/drawingml/2006/picture">
+                <pic:pic>
+                  <pic:nvPicPr>
+                    <pic:cNvPr descr="public/diagrams/u03-viaje-macs.svg" id="85" name="Picture"/>
+                    <pic:cNvPicPr>
+                      <a:picLocks noChangeArrowheads="1" noChangeAspect="1"/>
+                    </pic:cNvPicPr>
+                  </pic:nvPicPr>
+                  <pic:blipFill>
+                    <a:blip>
+                      <a:extLst>
+                        <a:ext uri="{28A0092B-C50C-407E-A947-70E740481C1C}">
+                          <a14:useLocalDpi xmlns:a14="http://schemas.microsoft.com/office/drawing/2010/main" val="0"/>
+                        </a:ext>
+                        <a:ext uri="{96DAC541-7B7A-43D3-8B79-37D633B846F1}">
+                          <asvg:svgBlip xmlns:asvg="http://schemas.microsoft.com/office/drawing/2016/SVG/main" r:embed="rId83"/>
+                        </a:ext>
+                      </a:extLst>
+                    </a:blip>
+                    <a:stretch>
+                      <a:fillRect/>
+                    </a:stretch>
+                  </pic:blipFill>
+                  <pic:spPr bwMode="auto">
+                    <a:xfrm>
+                      <a:off x="0" y="0"/>
+                      <a:ext cx="5334000" cy="3006436"/>
+                    </a:xfrm>
+                    <a:prstGeom prst="rect">
+                      <a:avLst/>
+                    </a:prstGeom>
+                    <a:noFill/>
+                    <a:ln w="9525">
+                      <a:noFill/>
+                      <a:headEnd/>
+                      <a:tailEnd/>
+                    </a:ln>
+                  </pic:spPr>
+                </pic:pic>
+              </a:graphicData>
+            </a:graphic>
+          </wp:inline>
+        </w:drawing>
+      </w:r>
+    </w:p>
+    <w:p>
+      <w:pPr>
+        <w:pStyle w:val="ImageCaption"/>
+      </w:pPr>
+      <w:r>
+        <w:t xml:space="preserve">Viaje de un paquete de la PC al servidor: la trama usa MACs de PC a router y luego de router a servidor, mientras la IP de destino se conserva en todo el recorrido</w:t>
       </w:r>
     </w:p>
     <w:tbl>
@@ -9356,8 +9484,8 @@
         </w:pict>
       </w:r>
     </w:p>
-    <w:bookmarkEnd w:id="80"/>
-    <w:bookmarkStart w:id="81" w:name="desencapsular-el-proceso-al-revés"/>
+    <w:bookmarkEnd w:id="86"/>
+    <w:bookmarkStart w:id="87" w:name="desencapsular-el-proceso-al-revés"/>
     <w:p>
       <w:pPr>
         <w:pStyle w:val="Heading2"/>
@@ -9524,8 +9652,8 @@
         </w:pict>
       </w:r>
     </w:p>
-    <w:bookmarkEnd w:id="81"/>
-    <w:bookmarkStart w:id="82" w:name="solo-el-nombre-arp-otra-vez"/>
+    <w:bookmarkEnd w:id="87"/>
+    <w:bookmarkStart w:id="88" w:name="solo-el-nombre-arp-otra-vez"/>
     <w:p>
       <w:pPr>
         <w:pStyle w:val="Heading2"/>
@@ -9589,7 +9717,7 @@
       <w:r>
         <w:t xml:space="preserve"> </w:t>
       </w:r>
-      <w:hyperlink r:id="rId56">
+      <w:hyperlink r:id="rId59">
         <w:r>
           <w:rPr>
             <w:rStyle w:val="Hyperlink"/>
@@ -9621,8 +9749,8 @@
         </w:pict>
       </w:r>
     </w:p>
-    <w:bookmarkEnd w:id="82"/>
-    <w:bookmarkStart w:id="83" w:name="mini-chequeo-3"/>
+    <w:bookmarkEnd w:id="88"/>
+    <w:bookmarkStart w:id="89" w:name="mini-chequeo-3"/>
     <w:p>
       <w:pPr>
         <w:pStyle w:val="Heading2"/>
@@ -9893,8 +10021,8 @@
         </w:pict>
       </w:r>
     </w:p>
-    <w:bookmarkEnd w:id="83"/>
-    <w:bookmarkStart w:id="84" w:name="resumen-en-3-frases-3"/>
+    <w:bookmarkEnd w:id="89"/>
+    <w:bookmarkStart w:id="90" w:name="resumen-en-3-frases-3"/>
     <w:p>
       <w:pPr>
         <w:pStyle w:val="Heading2"/>
@@ -9997,8 +10125,8 @@
         <w:t xml:space="preserve">y entrega el contenido de dentro.</w:t>
       </w:r>
     </w:p>
-    <w:bookmarkEnd w:id="84"/>
-    <w:bookmarkStart w:id="85" w:name="vocabulario-rápido-3"/>
+    <w:bookmarkEnd w:id="90"/>
+    <w:bookmarkStart w:id="91" w:name="vocabulario-rápido-3"/>
     <w:p>
       <w:pPr>
         <w:pStyle w:val="Heading2"/>
@@ -10258,9 +10386,9 @@
         </w:r>
       </w:hyperlink>
     </w:p>
-    <w:bookmarkEnd w:id="85"/>
-    <w:bookmarkEnd w:id="86"/>
-    <w:bookmarkStart w:id="98" w:name="cierre-consolida-lo-aprendido"/>
+    <w:bookmarkEnd w:id="91"/>
+    <w:bookmarkEnd w:id="92"/>
+    <w:bookmarkStart w:id="104" w:name="cierre-consolida-lo-aprendido"/>
     <w:p>
       <w:pPr>
         <w:pStyle w:val="Heading1"/>
@@ -10356,7 +10484,7 @@
         </w:pict>
       </w:r>
     </w:p>
-    <w:bookmarkStart w:id="87" w:name="sé-el-paquete"/>
+    <w:bookmarkStart w:id="93" w:name="sé-el-paquete"/>
     <w:p>
       <w:pPr>
         <w:pStyle w:val="Heading2"/>
@@ -10571,8 +10699,8 @@
         </w:pict>
       </w:r>
     </w:p>
-    <w:bookmarkEnd w:id="87"/>
-    <w:bookmarkStart w:id="88" w:name="fireside-chat-mac-vs-ip"/>
+    <w:bookmarkEnd w:id="93"/>
+    <w:bookmarkStart w:id="94" w:name="fireside-chat-mac-vs-ip"/>
     <w:p>
       <w:pPr>
         <w:pStyle w:val="Heading2"/>
@@ -10917,8 +11045,8 @@
         </w:pict>
       </w:r>
     </w:p>
-    <w:bookmarkEnd w:id="88"/>
-    <w:bookmarkStart w:id="89" w:name="quién-soy"/>
+    <w:bookmarkEnd w:id="94"/>
+    <w:bookmarkStart w:id="95" w:name="quién-soy"/>
     <w:p>
       <w:pPr>
         <w:pStyle w:val="Heading2"/>
@@ -11080,8 +11208,8 @@
         </w:pict>
       </w:r>
     </w:p>
-    <w:bookmarkEnd w:id="89"/>
-    <w:bookmarkStart w:id="90" w:name="X70e6344609ffa0f5af25f471f6774440bb08859"/>
+    <w:bookmarkEnd w:id="95"/>
+    <w:bookmarkStart w:id="96" w:name="X70e6344609ffa0f5af25f471f6774440bb08859"/>
     <w:p>
       <w:pPr>
         <w:pStyle w:val="Heading2"/>
@@ -11389,8 +11517,8 @@
         </w:pict>
       </w:r>
     </w:p>
-    <w:bookmarkEnd w:id="90"/>
-    <w:bookmarkStart w:id="91" w:name="X3ba5e15fba67d97aa3ed89f456670c16e87b8ec"/>
+    <w:bookmarkEnd w:id="96"/>
+    <w:bookmarkStart w:id="97" w:name="X3ba5e15fba67d97aa3ed89f456670c16e87b8ec"/>
     <w:p>
       <w:pPr>
         <w:pStyle w:val="Heading2"/>
@@ -11774,8 +11902,8 @@
         </w:pict>
       </w:r>
     </w:p>
-    <w:bookmarkEnd w:id="91"/>
-    <w:bookmarkStart w:id="92" w:name="atrévete-a-pensar"/>
+    <w:bookmarkEnd w:id="97"/>
+    <w:bookmarkStart w:id="98" w:name="atrévete-a-pensar"/>
     <w:p>
       <w:pPr>
         <w:pStyle w:val="Heading2"/>
@@ -12040,8 +12168,8 @@
         </w:pict>
       </w:r>
     </w:p>
-    <w:bookmarkEnd w:id="92"/>
-    <w:bookmarkStart w:id="93" w:name="crucigrama-de-bits"/>
+    <w:bookmarkEnd w:id="98"/>
+    <w:bookmarkStart w:id="99" w:name="crucigrama-de-bits"/>
     <w:p>
       <w:pPr>
         <w:pStyle w:val="Heading2"/>
@@ -12196,8 +12324,8 @@
         </w:pict>
       </w:r>
     </w:p>
-    <w:bookmarkEnd w:id="93"/>
-    <w:bookmarkStart w:id="94" w:name="preguntas-de-entrevista-de-trabajo"/>
+    <w:bookmarkEnd w:id="99"/>
+    <w:bookmarkStart w:id="100" w:name="preguntas-de-entrevista-de-trabajo"/>
     <w:p>
       <w:pPr>
         <w:pStyle w:val="Heading2"/>
@@ -12396,8 +12524,8 @@
         </w:pict>
       </w:r>
     </w:p>
-    <w:bookmarkEnd w:id="94"/>
-    <w:bookmarkStart w:id="95" w:name="no-hay-preguntas-tontas"/>
+    <w:bookmarkEnd w:id="100"/>
+    <w:bookmarkStart w:id="101" w:name="no-hay-preguntas-tontas"/>
     <w:p>
       <w:pPr>
         <w:pStyle w:val="Heading2"/>
@@ -12607,8 +12735,8 @@
         </w:pict>
       </w:r>
     </w:p>
-    <w:bookmarkEnd w:id="95"/>
-    <w:bookmarkStart w:id="96" w:name="poscréditos"/>
+    <w:bookmarkEnd w:id="101"/>
+    <w:bookmarkStart w:id="102" w:name="poscréditos"/>
     <w:p>
       <w:pPr>
         <w:pStyle w:val="Heading2"/>
@@ -12674,8 +12802,8 @@
         </w:pict>
       </w:r>
     </w:p>
-    <w:bookmarkEnd w:id="96"/>
-    <w:bookmarkStart w:id="97" w:name="criterios-de-evaluación-cubiertos-ra1-1"/>
+    <w:bookmarkEnd w:id="102"/>
+    <w:bookmarkStart w:id="103" w:name="criterios-de-evaluación-cubiertos-ra1-1"/>
     <w:p>
       <w:pPr>
         <w:pStyle w:val="Heading2"/>
@@ -12869,8 +12997,8 @@
         </w:r>
       </w:hyperlink>
     </w:p>
-    <w:bookmarkEnd w:id="97"/>
-    <w:bookmarkEnd w:id="98"/>
+    <w:bookmarkEnd w:id="103"/>
+    <w:bookmarkEnd w:id="104"/>
     <w:sectPr/>
   </w:body>
 </w:document>

</xml_diff>